<commit_message>
Tira valor em dinheiro do app e separa o que o galpao pode fazer
Valor: some de ponta a ponta -- KPI de valor exposto, coluna no painel e no CSV,
campo de valor unitario no cadastro de tipos, e o calculo em painel() e extrato().
tipos_caixa fica so com nome e ativo; o schema traz o drop column comentado para
bancos ja criados.

Permissao: GALPAO entrava no painel com as mesmas cinco abas do ADMIN, incluindo
Lancar e Cadastros. Como e ele quem gera a divergencia na chegada, um Ajuste de
saldo deixaria ele apagar o proprio erro, e Cadastros deixaria trocar o PIN do
admin. Agora so ADMIN ve essas duas abas.

Vale registrar que isso e so a interface: a API continua sem autorizacao nenhuma.
Anotado no CLAUDE.md como o proximo passo real (Supabase Auth).

Co-Authored-By: Claude Opus 5 (1M context) <noreply@anthropic.com>
</commit_message>
<xml_diff>
--- a/manual.docx
+++ b/manual.docx
@@ -2099,23 +2099,7 @@
           <w:b w:val="0"/>
           <w:i w:val="0"/>
         </w:rPr>
-        <w:t xml:space="preserve">Nome e </w:t>
-      </w:r>
-      <w:r>
-        <w:rPr>
-          <w:rFonts w:ascii="Segoe UI" w:hAnsi="Segoe UI"/>
-          <w:b/>
-          <w:i w:val="0"/>
-        </w:rPr>
-        <w:t>valor unitário</w:t>
-      </w:r>
-      <w:r>
-        <w:rPr>
-          <w:rFonts w:ascii="Segoe UI" w:hAnsi="Segoe UI"/>
-          <w:b w:val="0"/>
-          <w:i w:val="0"/>
-        </w:rPr>
-        <w:t>. É o valor que transforma caixa perdida em reais no painel — sem ele, a perda fica só um número solto.</w:t>
+        <w:t>Só o nome e se está ativo. São os tipos que aparecem nas telas de saída, devolução e conferência — mantenha a lista curta, porque ela é escolhida no celular, com pressa.</w:t>
       </w:r>
     </w:p>
     <w:p>
@@ -2133,7 +2117,7 @@
           <w:b w:val="0"/>
           <w:i w:val="0"/>
         </w:rPr>
-        <w:t>Nome, perfil, PIN e local padrão. Um PIN por pessoa, nunca um PIN de função compartilhado entre vários: é o nome de quem contou que dá valor à divergência.</w:t>
+        <w:t>Nome, perfil, PIN e local padrão. Um PIN por pessoa, nunca um PIN de função compartilhado entre vários: é o nome de quem contou que dá peso à divergência.</w:t>
       </w:r>
     </w:p>
     <w:p>
@@ -2364,7 +2348,7 @@
                 <w:b w:val="0"/>
                 <w:i w:val="0"/>
               </w:rPr>
-              <w:t>Caixa aceita como perdida — sai do saldo do cliente e entra no valor de perda do mês</w:t>
+              <w:t>Caixa aceita como perdida — sai do saldo do cliente e entra nas perdas do mês</w:t>
             </w:r>
           </w:p>
         </w:tc>
@@ -2706,17 +2690,18 @@
         <w:tblLook w:firstColumn="1" w:firstRow="1" w:lastColumn="0" w:lastRow="0" w:noHBand="0" w:noVBand="1" w:val="04A0"/>
       </w:tblPr>
       <w:tblGrid>
-        <w:gridCol w:w="1569"/>
-        <w:gridCol w:w="1569"/>
-        <w:gridCol w:w="1569"/>
-        <w:gridCol w:w="1569"/>
-        <w:gridCol w:w="1569"/>
-        <w:gridCol w:w="1569"/>
+        <w:gridCol w:w="1345"/>
+        <w:gridCol w:w="1345"/>
+        <w:gridCol w:w="1345"/>
+        <w:gridCol w:w="1345"/>
+        <w:gridCol w:w="1345"/>
+        <w:gridCol w:w="1345"/>
+        <w:gridCol w:w="1345"/>
       </w:tblGrid>
       <w:tr>
         <w:tc>
           <w:tcPr>
-            <w:tcW w:type="dxa" w:w="1569"/>
+            <w:tcW w:type="dxa" w:w="1345"/>
             <w:shd w:val="clear" w:fill="EFF3F6"/>
           </w:tcPr>
           <w:p>
@@ -2733,7 +2718,7 @@
         </w:tc>
         <w:tc>
           <w:tcPr>
-            <w:tcW w:type="dxa" w:w="1569"/>
+            <w:tcW w:type="dxa" w:w="1345"/>
             <w:shd w:val="clear" w:fill="EFF3F6"/>
           </w:tcPr>
           <w:p>
@@ -2750,7 +2735,7 @@
         </w:tc>
         <w:tc>
           <w:tcPr>
-            <w:tcW w:type="dxa" w:w="1569"/>
+            <w:tcW w:type="dxa" w:w="1345"/>
             <w:shd w:val="clear" w:fill="EFF3F6"/>
           </w:tcPr>
           <w:p>
@@ -2767,7 +2752,7 @@
         </w:tc>
         <w:tc>
           <w:tcPr>
-            <w:tcW w:type="dxa" w:w="1569"/>
+            <w:tcW w:type="dxa" w:w="1345"/>
             <w:shd w:val="clear" w:fill="EFF3F6"/>
           </w:tcPr>
           <w:p>
@@ -2784,7 +2769,7 @@
         </w:tc>
         <w:tc>
           <w:tcPr>
-            <w:tcW w:type="dxa" w:w="1569"/>
+            <w:tcW w:type="dxa" w:w="1345"/>
             <w:shd w:val="clear" w:fill="EFF3F6"/>
           </w:tcPr>
           <w:p>
@@ -2801,7 +2786,7 @@
         </w:tc>
         <w:tc>
           <w:tcPr>
-            <w:tcW w:type="dxa" w:w="1569"/>
+            <w:tcW w:type="dxa" w:w="1345"/>
             <w:shd w:val="clear" w:fill="EFF3F6"/>
           </w:tcPr>
           <w:p>
@@ -2812,7 +2797,24 @@
                 <w:color w:val="63737E"/>
                 <w:sz w:val="17"/>
               </w:rPr>
-              <w:t>PAINEL</w:t>
+              <w:t>PAINEL E EXTRATOS</w:t>
+            </w:r>
+          </w:p>
+        </w:tc>
+        <w:tc>
+          <w:tcPr>
+            <w:tcW w:type="dxa" w:w="1345"/>
+            <w:shd w:val="clear" w:fill="EFF3F6"/>
+          </w:tcPr>
+          <w:p>
+            <w:r>
+              <w:rPr>
+                <w:rFonts w:ascii="Segoe UI" w:hAnsi="Segoe UI"/>
+                <w:b/>
+                <w:color w:val="63737E"/>
+                <w:sz w:val="17"/>
+              </w:rPr>
+              <w:t>LANÇAR E CADASTRAR</w:t>
             </w:r>
           </w:p>
         </w:tc>
@@ -2820,7 +2822,7 @@
       <w:tr>
         <w:tc>
           <w:tcPr>
-            <w:tcW w:type="dxa" w:w="1569"/>
+            <w:tcW w:type="dxa" w:w="1345"/>
           </w:tcPr>
           <w:p>
             <w:pPr>
@@ -2839,7 +2841,7 @@
         </w:tc>
         <w:tc>
           <w:tcPr>
-            <w:tcW w:type="dxa" w:w="1569"/>
+            <w:tcW w:type="dxa" w:w="1345"/>
           </w:tcPr>
           <w:p>
             <w:pPr>
@@ -2857,7 +2859,7 @@
         </w:tc>
         <w:tc>
           <w:tcPr>
-            <w:tcW w:type="dxa" w:w="1569"/>
+            <w:tcW w:type="dxa" w:w="1345"/>
           </w:tcPr>
           <w:p>
             <w:pPr>
@@ -2875,7 +2877,7 @@
         </w:tc>
         <w:tc>
           <w:tcPr>
-            <w:tcW w:type="dxa" w:w="1569"/>
+            <w:tcW w:type="dxa" w:w="1345"/>
           </w:tcPr>
           <w:p>
             <w:pPr>
@@ -2893,7 +2895,7 @@
         </w:tc>
         <w:tc>
           <w:tcPr>
-            <w:tcW w:type="dxa" w:w="1569"/>
+            <w:tcW w:type="dxa" w:w="1345"/>
           </w:tcPr>
           <w:p>
             <w:pPr>
@@ -2911,7 +2913,25 @@
         </w:tc>
         <w:tc>
           <w:tcPr>
-            <w:tcW w:type="dxa" w:w="1569"/>
+            <w:tcW w:type="dxa" w:w="1345"/>
+          </w:tcPr>
+          <w:p>
+            <w:pPr>
+              <w:spacing w:after="40"/>
+            </w:pPr>
+            <w:r>
+              <w:rPr>
+                <w:rFonts w:ascii="Segoe UI" w:hAnsi="Segoe UI"/>
+                <w:b w:val="0"/>
+                <w:i w:val="0"/>
+              </w:rPr>
+              <w:t>—</w:t>
+            </w:r>
+          </w:p>
+        </w:tc>
+        <w:tc>
+          <w:tcPr>
+            <w:tcW w:type="dxa" w:w="1345"/>
           </w:tcPr>
           <w:p>
             <w:pPr>
@@ -2931,7 +2951,7 @@
       <w:tr>
         <w:tc>
           <w:tcPr>
-            <w:tcW w:type="dxa" w:w="1569"/>
+            <w:tcW w:type="dxa" w:w="1345"/>
           </w:tcPr>
           <w:p>
             <w:pPr>
@@ -2950,7 +2970,7 @@
         </w:tc>
         <w:tc>
           <w:tcPr>
-            <w:tcW w:type="dxa" w:w="1569"/>
+            <w:tcW w:type="dxa" w:w="1345"/>
           </w:tcPr>
           <w:p>
             <w:pPr>
@@ -2968,7 +2988,7 @@
         </w:tc>
         <w:tc>
           <w:tcPr>
-            <w:tcW w:type="dxa" w:w="1569"/>
+            <w:tcW w:type="dxa" w:w="1345"/>
           </w:tcPr>
           <w:p>
             <w:pPr>
@@ -2986,7 +3006,7 @@
         </w:tc>
         <w:tc>
           <w:tcPr>
-            <w:tcW w:type="dxa" w:w="1569"/>
+            <w:tcW w:type="dxa" w:w="1345"/>
           </w:tcPr>
           <w:p>
             <w:pPr>
@@ -3004,7 +3024,7 @@
         </w:tc>
         <w:tc>
           <w:tcPr>
-            <w:tcW w:type="dxa" w:w="1569"/>
+            <w:tcW w:type="dxa" w:w="1345"/>
           </w:tcPr>
           <w:p>
             <w:pPr>
@@ -3022,7 +3042,25 @@
         </w:tc>
         <w:tc>
           <w:tcPr>
-            <w:tcW w:type="dxa" w:w="1569"/>
+            <w:tcW w:type="dxa" w:w="1345"/>
+          </w:tcPr>
+          <w:p>
+            <w:pPr>
+              <w:spacing w:after="40"/>
+            </w:pPr>
+            <w:r>
+              <w:rPr>
+                <w:rFonts w:ascii="Segoe UI" w:hAnsi="Segoe UI"/>
+                <w:b w:val="0"/>
+                <w:i w:val="0"/>
+              </w:rPr>
+              <w:t>—</w:t>
+            </w:r>
+          </w:p>
+        </w:tc>
+        <w:tc>
+          <w:tcPr>
+            <w:tcW w:type="dxa" w:w="1345"/>
           </w:tcPr>
           <w:p>
             <w:pPr>
@@ -3042,7 +3080,7 @@
       <w:tr>
         <w:tc>
           <w:tcPr>
-            <w:tcW w:type="dxa" w:w="1569"/>
+            <w:tcW w:type="dxa" w:w="1345"/>
           </w:tcPr>
           <w:p>
             <w:pPr>
@@ -3061,7 +3099,7 @@
         </w:tc>
         <w:tc>
           <w:tcPr>
-            <w:tcW w:type="dxa" w:w="1569"/>
+            <w:tcW w:type="dxa" w:w="1345"/>
           </w:tcPr>
           <w:p>
             <w:pPr>
@@ -3079,7 +3117,7 @@
         </w:tc>
         <w:tc>
           <w:tcPr>
-            <w:tcW w:type="dxa" w:w="1569"/>
+            <w:tcW w:type="dxa" w:w="1345"/>
           </w:tcPr>
           <w:p>
             <w:pPr>
@@ -3097,7 +3135,7 @@
         </w:tc>
         <w:tc>
           <w:tcPr>
-            <w:tcW w:type="dxa" w:w="1569"/>
+            <w:tcW w:type="dxa" w:w="1345"/>
           </w:tcPr>
           <w:p>
             <w:pPr>
@@ -3115,7 +3153,7 @@
         </w:tc>
         <w:tc>
           <w:tcPr>
-            <w:tcW w:type="dxa" w:w="1569"/>
+            <w:tcW w:type="dxa" w:w="1345"/>
           </w:tcPr>
           <w:p>
             <w:pPr>
@@ -3133,7 +3171,25 @@
         </w:tc>
         <w:tc>
           <w:tcPr>
-            <w:tcW w:type="dxa" w:w="1569"/>
+            <w:tcW w:type="dxa" w:w="1345"/>
+          </w:tcPr>
+          <w:p>
+            <w:pPr>
+              <w:spacing w:after="40"/>
+            </w:pPr>
+            <w:r>
+              <w:rPr>
+                <w:rFonts w:ascii="Segoe UI" w:hAnsi="Segoe UI"/>
+                <w:b w:val="0"/>
+                <w:i w:val="0"/>
+              </w:rPr>
+              <w:t>sim</w:t>
+            </w:r>
+          </w:p>
+        </w:tc>
+        <w:tc>
+          <w:tcPr>
+            <w:tcW w:type="dxa" w:w="1345"/>
           </w:tcPr>
           <w:p>
             <w:pPr>
@@ -3153,7 +3209,7 @@
       <w:tr>
         <w:tc>
           <w:tcPr>
-            <w:tcW w:type="dxa" w:w="1569"/>
+            <w:tcW w:type="dxa" w:w="1345"/>
           </w:tcPr>
           <w:p>
             <w:pPr>
@@ -3172,7 +3228,7 @@
         </w:tc>
         <w:tc>
           <w:tcPr>
-            <w:tcW w:type="dxa" w:w="1569"/>
+            <w:tcW w:type="dxa" w:w="1345"/>
           </w:tcPr>
           <w:p>
             <w:pPr>
@@ -3190,7 +3246,7 @@
         </w:tc>
         <w:tc>
           <w:tcPr>
-            <w:tcW w:type="dxa" w:w="1569"/>
+            <w:tcW w:type="dxa" w:w="1345"/>
           </w:tcPr>
           <w:p>
             <w:pPr>
@@ -3208,7 +3264,7 @@
         </w:tc>
         <w:tc>
           <w:tcPr>
-            <w:tcW w:type="dxa" w:w="1569"/>
+            <w:tcW w:type="dxa" w:w="1345"/>
           </w:tcPr>
           <w:p>
             <w:pPr>
@@ -3226,7 +3282,7 @@
         </w:tc>
         <w:tc>
           <w:tcPr>
-            <w:tcW w:type="dxa" w:w="1569"/>
+            <w:tcW w:type="dxa" w:w="1345"/>
           </w:tcPr>
           <w:p>
             <w:pPr>
@@ -3244,7 +3300,25 @@
         </w:tc>
         <w:tc>
           <w:tcPr>
-            <w:tcW w:type="dxa" w:w="1569"/>
+            <w:tcW w:type="dxa" w:w="1345"/>
+          </w:tcPr>
+          <w:p>
+            <w:pPr>
+              <w:spacing w:after="40"/>
+            </w:pPr>
+            <w:r>
+              <w:rPr>
+                <w:rFonts w:ascii="Segoe UI" w:hAnsi="Segoe UI"/>
+                <w:b w:val="0"/>
+                <w:i w:val="0"/>
+              </w:rPr>
+              <w:t>sim</w:t>
+            </w:r>
+          </w:p>
+        </w:tc>
+        <w:tc>
+          <w:tcPr>
+            <w:tcW w:type="dxa" w:w="1345"/>
           </w:tcPr>
           <w:p>
             <w:pPr>
@@ -3473,7 +3547,7 @@
                 <w:b w:val="0"/>
                 <w:i w:val="0"/>
               </w:rPr>
-              <w:t>Baixa do saldo do cliente e vira valor em reais</w:t>
+              <w:t>Baixa do saldo do cliente e entra na conta de perdas do mês</w:t>
             </w:r>
           </w:p>
         </w:tc>
@@ -3871,7 +3945,7 @@
                 <w:b w:val="0"/>
                 <w:i w:val="0"/>
               </w:rPr>
-              <w:t>Tipos de caixa e valor unitário</w:t>
+              <w:t>Tipos de caixa</w:t>
             </w:r>
           </w:p>
         </w:tc>

</xml_diff>

<commit_message>
Tipo de caixa ganha tamanho (PP a GG) e peso em kg
Os dois sao opcionais. O ganho pratico nao e o cadastro em si: e o rotulo que
passa a aparecer nas listagens -- 'Caixa Banana G - 20 kg'. Sem ele, duas caixas
de mesmo nome e tamanhos diferentes ficam identicas justamente na conferencia,
que e onde a contagem precisa ser exata.

Banco existente precisa de supabase/migracao-tamanho-kg.sql.

Co-Authored-By: Claude Opus 5 (1M context) <noreply@anthropic.com>
</commit_message>
<xml_diff>
--- a/manual.docx
+++ b/manual.docx
@@ -2630,7 +2630,55 @@
           <w:b w:val="0"/>
           <w:i w:val="0"/>
         </w:rPr>
-        <w:t>Só o nome e se está ativo. São os tipos que aparecem nas telas de saída, devolução e conferência — mantenha a lista curta, porque ela é escolhida no celular, com pressa.</w:t>
+        <w:t xml:space="preserve">Nome, </w:t>
+      </w:r>
+      <w:r>
+        <w:rPr>
+          <w:rFonts w:ascii="Segoe UI" w:hAnsi="Segoe UI"/>
+          <w:b/>
+          <w:i w:val="0"/>
+        </w:rPr>
+        <w:t>tamanho</w:t>
+      </w:r>
+      <w:r>
+        <w:rPr>
+          <w:rFonts w:ascii="Segoe UI" w:hAnsi="Segoe UI"/>
+          <w:b w:val="0"/>
+          <w:i w:val="0"/>
+        </w:rPr>
+        <w:t xml:space="preserve"> (PP, P, M, G ou GG) e </w:t>
+      </w:r>
+      <w:r>
+        <w:rPr>
+          <w:rFonts w:ascii="Segoe UI" w:hAnsi="Segoe UI"/>
+          <w:b/>
+          <w:i w:val="0"/>
+        </w:rPr>
+        <w:t>peso em quilos</w:t>
+      </w:r>
+      <w:r>
+        <w:rPr>
+          <w:rFonts w:ascii="Segoe UI" w:hAnsi="Segoe UI"/>
+          <w:b w:val="0"/>
+          <w:i w:val="0"/>
+        </w:rPr>
+        <w:t xml:space="preserve">. Os dois últimos são opcionais, mas valem a pena: é o que separa duas caixas de mesmo nome na hora da conferência, quando aparecem como </w:t>
+      </w:r>
+      <w:r>
+        <w:rPr>
+          <w:rFonts w:ascii="Segoe UI" w:hAnsi="Segoe UI"/>
+          <w:b w:val="0"/>
+          <w:i/>
+        </w:rPr>
+        <w:t>Caixa Banana G · 20 kg</w:t>
+      </w:r>
+      <w:r>
+        <w:rPr>
+          <w:rFonts w:ascii="Segoe UI" w:hAnsi="Segoe UI"/>
+          <w:b w:val="0"/>
+          <w:i w:val="0"/>
+        </w:rPr>
+        <w:t>. Mantenha a lista curta — ela é escolhida no celular, com pressa.</w:t>
       </w:r>
     </w:p>
     <w:p>
@@ -4476,7 +4524,7 @@
                 <w:b w:val="0"/>
                 <w:i w:val="0"/>
               </w:rPr>
-              <w:t>Tipos de caixa</w:t>
+              <w:t>Tipos de caixa, com tamanho e peso</w:t>
             </w:r>
           </w:p>
         </w:tc>

</xml_diff>

<commit_message>
Saida: sai o canhoto, entram Motorista e Placa na carga do galpao
Os dois campos aparecem so quando a origem e um GALPAO, e ai sao obrigatorios.
E o momento em que a caixa entra em circulacao: depois disso ninguem mais sabe
dizer quem levou. Da rota para o cliente eles nao aparecem, porque quem leva ja
esta implicito na rota.

A assinatura sai da Saida (o motorista assinava no proprio celular, o que nao
provava nada) e continua na Devolucao, onde quem entrega e outra pessoa.

Banco existente precisa de supabase/migracao-motorista-placa.sql.

Co-Authored-By: Claude Opus 5 (1M context) <noreply@anthropic.com>
</commit_message>
<xml_diff>
--- a/manual.docx
+++ b/manual.docx
@@ -1079,7 +1079,7 @@
           <w:b w:val="0"/>
           <w:i w:val="0"/>
         </w:rPr>
-        <w:t xml:space="preserve"> (galpão ou filial), </w:t>
+        <w:t xml:space="preserve"> (galpão, filial ou rota), </w:t>
       </w:r>
       <w:r>
         <w:rPr>
@@ -1128,6 +1128,68 @@
           <w:i w:val="0"/>
         </w:rPr>
         <w:t>.</w:t>
+      </w:r>
+    </w:p>
+    <w:p>
+      <w:pPr>
+        <w:spacing w:after="120"/>
+        <w:ind w:left="907"/>
+      </w:pPr>
+      <w:r>
+        <w:rPr>
+          <w:rFonts w:ascii="Segoe UI" w:hAnsi="Segoe UI"/>
+          <w:b w:val="0"/>
+          <w:i w:val="0"/>
+        </w:rPr>
+        <w:t xml:space="preserve">Quando a carga sai de um </w:t>
+      </w:r>
+      <w:r>
+        <w:rPr>
+          <w:rFonts w:ascii="Segoe UI" w:hAnsi="Segoe UI"/>
+          <w:b/>
+          <w:i w:val="0"/>
+        </w:rPr>
+        <w:t>galpão</w:t>
+      </w:r>
+      <w:r>
+        <w:rPr>
+          <w:rFonts w:ascii="Segoe UI" w:hAnsi="Segoe UI"/>
+          <w:b w:val="0"/>
+          <w:i w:val="0"/>
+        </w:rPr>
+        <w:t xml:space="preserve">, aparecem também </w:t>
+      </w:r>
+      <w:r>
+        <w:rPr>
+          <w:rFonts w:ascii="Segoe UI" w:hAnsi="Segoe UI"/>
+          <w:b/>
+          <w:i w:val="0"/>
+        </w:rPr>
+        <w:t>Motorista</w:t>
+      </w:r>
+      <w:r>
+        <w:rPr>
+          <w:rFonts w:ascii="Segoe UI" w:hAnsi="Segoe UI"/>
+          <w:b w:val="0"/>
+          <w:i w:val="0"/>
+        </w:rPr>
+        <w:t xml:space="preserve"> e </w:t>
+      </w:r>
+      <w:r>
+        <w:rPr>
+          <w:rFonts w:ascii="Segoe UI" w:hAnsi="Segoe UI"/>
+          <w:b/>
+          <w:i w:val="0"/>
+        </w:rPr>
+        <w:t>Placa do veículo</w:t>
+      </w:r>
+      <w:r>
+        <w:rPr>
+          <w:rFonts w:ascii="Segoe UI" w:hAnsi="Segoe UI"/>
+          <w:b w:val="0"/>
+          <w:i w:val="0"/>
+        </w:rPr>
+        <w:t>, e os dois são obrigatórios: é ali que a caixa entra em circulação, e é a última hora em que dá para registrar quem levou.</w:t>
       </w:r>
     </w:p>
     <w:p>
@@ -1215,7 +1277,7 @@
         <w:rPr>
           <w:b/>
         </w:rPr>
-        <w:t>Colha o canhoto</w:t>
+        <w:t>Anexe a foto do romaneio</w:t>
       </w:r>
     </w:p>
     <w:p>
@@ -1229,7 +1291,7 @@
           <w:b w:val="0"/>
           <w:i w:val="0"/>
         </w:rPr>
-        <w:t>Quem recebeu assina com o dedo na tela, e dá para anexar foto do romaneio. A assinatura registra que a contagem foi aceita pelas duas partes.</w:t>
+        <w:t>Opcional, mas é o que sustenta a contagem se alguém contestar depois.</w:t>
       </w:r>
     </w:p>
     <w:p>

</xml_diff>

<commit_message>
Tira o campo Tamanho e faz o erro de coluna faltando aparecer na tela
Tamanho sai do tipo de caixa a pedido do usuario. Como a migracao dele nunca
chegou a rodar, apaguei o campo em vez de empilhar correcao: a migracao de kg
foi reescrita e ja traz o drop, para o caso de alguem ter rodado a versao antiga.

O erro ao salvar aparecia como 'Falha no servidor' porque eu so tratava 42703 e
42P01, que sao codigos do Postgres direto. Coluna inexistente em ESCRITA pelo
PostgREST vem como PGRST204 -- justamente o caso mais comum, migracao pendente
na hora de salvar. Agora os dois formatos viram o recado que diz o que fazer.

Junta tambem supabase/migracao.sql, um arquivo unico e idempotente com tudo que
o banco precisa desde o schema inicial. Tres migracoes separadas acumuladas eram
convite a rodar fora de ordem.

Co-Authored-By: Claude Opus 5 (1M context) <noreply@anthropic.com>
</commit_message>
<xml_diff>
--- a/manual.docx
+++ b/manual.docx
@@ -2692,23 +2692,7 @@
           <w:b w:val="0"/>
           <w:i w:val="0"/>
         </w:rPr>
-        <w:t xml:space="preserve">Nome, </w:t>
-      </w:r>
-      <w:r>
-        <w:rPr>
-          <w:rFonts w:ascii="Segoe UI" w:hAnsi="Segoe UI"/>
-          <w:b/>
-          <w:i w:val="0"/>
-        </w:rPr>
-        <w:t>tamanho</w:t>
-      </w:r>
-      <w:r>
-        <w:rPr>
-          <w:rFonts w:ascii="Segoe UI" w:hAnsi="Segoe UI"/>
-          <w:b w:val="0"/>
-          <w:i w:val="0"/>
-        </w:rPr>
-        <w:t xml:space="preserve"> (PP, P, M, G e GG são sugestões — dá para digitar qualquer outro) e </w:t>
+        <w:t xml:space="preserve">Nome e </w:t>
       </w:r>
       <w:r>
         <w:rPr>
@@ -2724,7 +2708,7 @@
           <w:b w:val="0"/>
           <w:i w:val="0"/>
         </w:rPr>
-        <w:t xml:space="preserve">. Os dois últimos são opcionais, mas valem a pena: é o que separa duas caixas de mesmo nome na hora da conferência, quando aparecem como </w:t>
+        <w:t xml:space="preserve">. O peso é opcional, mas vale a pena: é o que separa duas caixas de mesmo nome na hora da conferência, quando aparecem como </w:t>
       </w:r>
       <w:r>
         <w:rPr>
@@ -2732,7 +2716,7 @@
           <w:b w:val="0"/>
           <w:i/>
         </w:rPr>
-        <w:t>Caixa Banana G · 20 kg</w:t>
+        <w:t>Caixa Banana · 20 kg</w:t>
       </w:r>
       <w:r>
         <w:rPr>
@@ -4586,7 +4570,7 @@
                 <w:b w:val="0"/>
                 <w:i w:val="0"/>
               </w:rPr>
-              <w:t>Tipos de caixa, com tamanho e peso</w:t>
+              <w:t>Tipos de caixa e o peso de cada um</w:t>
             </w:r>
           </w:p>
         </w:tc>

</xml_diff>

<commit_message>
Ativar/desativar usuario na lista e campo Rota na carga do galpao
Usuario: botao na propria linha, com a coluna Ativo. Desativa em vez de excluir
porque o historico de movimentos aponta para ele -- apagar deixaria lancamento
orfao. Inativo some das listas e nao entra mais; reativar devolve o acesso.

Rota: terceiro campo obrigatorio quando a carga sai do galpao, ao lado de
motorista e placa. Digitavel com as rotas cadastradas como sugestao -- carga sem
rota e pior do que rota escrita a mao. Entra na tabela de movimentos e no CSV.

As seis rotas da operacao (Caruaru, Joao Pessoa, Maceio, Natal, Recife, Russas)
vao cadastradas como locais tipo ROTA na migracao, cada uma com saldo proprio.

Co-Authored-By: Claude Opus 5 (1M context) <noreply@anthropic.com>
</commit_message>
<xml_diff>
--- a/manual.docx
+++ b/manual.docx
@@ -1173,7 +1173,7 @@
           <w:b w:val="0"/>
           <w:i w:val="0"/>
         </w:rPr>
-        <w:t xml:space="preserve"> e </w:t>
+        <w:t xml:space="preserve">, </w:t>
       </w:r>
       <w:r>
         <w:rPr>
@@ -1189,7 +1189,23 @@
           <w:b w:val="0"/>
           <w:i w:val="0"/>
         </w:rPr>
-        <w:t>, e os dois são obrigatórios: é ali que a caixa entra em circulação, e é a última hora em que dá para registrar quem levou.</w:t>
+        <w:t xml:space="preserve"> e </w:t>
+      </w:r>
+      <w:r>
+        <w:rPr>
+          <w:rFonts w:ascii="Segoe UI" w:hAnsi="Segoe UI"/>
+          <w:b/>
+          <w:i w:val="0"/>
+        </w:rPr>
+        <w:t>Rota</w:t>
+      </w:r>
+      <w:r>
+        <w:rPr>
+          <w:rFonts w:ascii="Segoe UI" w:hAnsi="Segoe UI"/>
+          <w:b w:val="0"/>
+          <w:i w:val="0"/>
+        </w:rPr>
+        <w:t>, os três obrigatórios: é ali que a caixa entra em circulação, e é a última hora em que dá para registrar quem levou e por onde. A rota tem sugestão das cadastradas, mas aceita qualquer nome digitado — carga sem rota é pior do que rota escrita à mão.</w:t>
       </w:r>
     </w:p>
     <w:p>
@@ -2743,6 +2759,32 @@
           <w:i w:val="0"/>
         </w:rPr>
         <w:t>Nome, perfil, PIN e local padrão. Um PIN por pessoa, nunca um PIN de função compartilhado entre vários: é o nome de quem contou que dá peso à divergência.</w:t>
+      </w:r>
+    </w:p>
+    <w:p>
+      <w:r>
+        <w:rPr>
+          <w:rFonts w:ascii="Segoe UI" w:hAnsi="Segoe UI"/>
+          <w:b w:val="0"/>
+          <w:i w:val="0"/>
+        </w:rPr>
+        <w:t xml:space="preserve">Quem sai da empresa se </w:t>
+      </w:r>
+      <w:r>
+        <w:rPr>
+          <w:rFonts w:ascii="Segoe UI" w:hAnsi="Segoe UI"/>
+          <w:b/>
+          <w:i w:val="0"/>
+        </w:rPr>
+        <w:t>desativa</w:t>
+      </w:r>
+      <w:r>
+        <w:rPr>
+          <w:rFonts w:ascii="Segoe UI" w:hAnsi="Segoe UI"/>
+          <w:b w:val="0"/>
+          <w:i w:val="0"/>
+        </w:rPr>
+        <w:t>, pelo botão na lista — não se apaga. O histórico de movimentos aponta para o usuário, e apagar deixaria lançamento órfão. Inativo some das listas e não consegue mais entrar; reativar devolve o acesso.</w:t>
       </w:r>
     </w:p>
     <w:p>

</xml_diff>

<commit_message>
Ativar, desativar e excluir local e rota na propria lista
Mesmo padrao dos usuarios. Excluir so vale para cadastro que nunca rodou: com
movimento, o servidor ja inativava; agora rota com cliente vinculado tambem
inativa, em vez de estourar a chave estrangeira e mostrar erro cru do banco.
O aviso diz quantos pontos dependem da rota.

Co-Authored-By: Claude Opus 5 (1M context) <noreply@anthropic.com>
</commit_message>
<xml_diff>
--- a/manual.docx
+++ b/manual.docx
@@ -2692,6 +2692,64 @@
       <w:pPr>
         <w:spacing w:after="40"/>
       </w:pPr>
+    </w:p>
+    <w:p>
+      <w:r>
+        <w:rPr>
+          <w:rFonts w:ascii="Segoe UI" w:hAnsi="Segoe UI"/>
+          <w:b w:val="0"/>
+          <w:i w:val="0"/>
+        </w:rPr>
+        <w:t xml:space="preserve">Na lista, cada local tem </w:t>
+      </w:r>
+      <w:r>
+        <w:rPr>
+          <w:rFonts w:ascii="Segoe UI" w:hAnsi="Segoe UI"/>
+          <w:b/>
+          <w:i w:val="0"/>
+        </w:rPr>
+        <w:t>desativar</w:t>
+      </w:r>
+      <w:r>
+        <w:rPr>
+          <w:rFonts w:ascii="Segoe UI" w:hAnsi="Segoe UI"/>
+          <w:b w:val="0"/>
+          <w:i w:val="0"/>
+        </w:rPr>
+        <w:t xml:space="preserve"> e </w:t>
+      </w:r>
+      <w:r>
+        <w:rPr>
+          <w:rFonts w:ascii="Segoe UI" w:hAnsi="Segoe UI"/>
+          <w:b/>
+          <w:i w:val="0"/>
+        </w:rPr>
+        <w:t>excluir</w:t>
+      </w:r>
+      <w:r>
+        <w:rPr>
+          <w:rFonts w:ascii="Segoe UI" w:hAnsi="Segoe UI"/>
+          <w:b w:val="0"/>
+          <w:i w:val="0"/>
+        </w:rPr>
+        <w:t xml:space="preserve">. Excluir só funciona em cadastro que nunca rodou: se já tem movimento — ou se é uma rota que já atende algum cliente — o sistema </w:t>
+      </w:r>
+      <w:r>
+        <w:rPr>
+          <w:rFonts w:ascii="Segoe UI" w:hAnsi="Segoe UI"/>
+          <w:b/>
+          <w:i w:val="0"/>
+        </w:rPr>
+        <w:t>desativa</w:t>
+      </w:r>
+      <w:r>
+        <w:rPr>
+          <w:rFonts w:ascii="Segoe UI" w:hAnsi="Segoe UI"/>
+          <w:b w:val="0"/>
+          <w:i w:val="0"/>
+        </w:rPr>
+        <w:t xml:space="preserve"> e avisa, porque apagar deixaria o histórico apontando para o vazio.</w:t>
+      </w:r>
     </w:p>
     <w:p>
       <w:pPr>

</xml_diff>

<commit_message>
Saida do galpao vai para a rota; sai o campo Placa
Placa removida da tela, do payload, da tabela de movimentos e do CSV.

'Vai para' deixa de aparecer quando a origem e um galpao: no lugar entra 'Vai
para a rota', e o destino do movimento passa a ser a propria rota. A carga nao
vai direto ao cliente -- ela sobe no caminhao, que guarda a caixa ate a entrega.
Da rota para o cliente, o campo volta a ser 'Vai para'.

E o que faz o saldo fechar: sem isso, o que subiu no caminhao e nao foi entregue
aparecia na conta de um cliente que nunca viu aquela caixa.

Co-Authored-By: Claude Opus 5 (1M context) <noreply@anthropic.com>
</commit_message>
<xml_diff>
--- a/manual.docx
+++ b/manual.docx
@@ -1141,7 +1141,7 @@
           <w:b w:val="0"/>
           <w:i w:val="0"/>
         </w:rPr>
-        <w:t xml:space="preserve">Quando a carga sai de um </w:t>
+        <w:t xml:space="preserve">Saindo de um </w:t>
       </w:r>
       <w:r>
         <w:rPr>
@@ -1157,7 +1157,39 @@
           <w:b w:val="0"/>
           <w:i w:val="0"/>
         </w:rPr>
-        <w:t xml:space="preserve">, aparecem também </w:t>
+        <w:t xml:space="preserve"> a tela muda: no lugar de </w:t>
+      </w:r>
+      <w:r>
+        <w:rPr>
+          <w:rFonts w:ascii="Segoe UI" w:hAnsi="Segoe UI"/>
+          <w:b w:val="0"/>
+          <w:i/>
+        </w:rPr>
+        <w:t>Vai para</w:t>
+      </w:r>
+      <w:r>
+        <w:rPr>
+          <w:rFonts w:ascii="Segoe UI" w:hAnsi="Segoe UI"/>
+          <w:b w:val="0"/>
+          <w:i w:val="0"/>
+        </w:rPr>
+        <w:t xml:space="preserve"> aparece </w:t>
+      </w:r>
+      <w:r>
+        <w:rPr>
+          <w:rFonts w:ascii="Segoe UI" w:hAnsi="Segoe UI"/>
+          <w:b/>
+          <w:i w:val="0"/>
+        </w:rPr>
+        <w:t>Vai para a rota</w:t>
+      </w:r>
+      <w:r>
+        <w:rPr>
+          <w:rFonts w:ascii="Segoe UI" w:hAnsi="Segoe UI"/>
+          <w:b w:val="0"/>
+          <w:i w:val="0"/>
+        </w:rPr>
+        <w:t xml:space="preserve">, mais o </w:t>
       </w:r>
       <w:r>
         <w:rPr>
@@ -1173,39 +1205,7 @@
           <w:b w:val="0"/>
           <w:i w:val="0"/>
         </w:rPr>
-        <w:t xml:space="preserve">, </w:t>
-      </w:r>
-      <w:r>
-        <w:rPr>
-          <w:rFonts w:ascii="Segoe UI" w:hAnsi="Segoe UI"/>
-          <w:b/>
-          <w:i w:val="0"/>
-        </w:rPr>
-        <w:t>Placa do veículo</w:t>
-      </w:r>
-      <w:r>
-        <w:rPr>
-          <w:rFonts w:ascii="Segoe UI" w:hAnsi="Segoe UI"/>
-          <w:b w:val="0"/>
-          <w:i w:val="0"/>
-        </w:rPr>
-        <w:t xml:space="preserve"> e </w:t>
-      </w:r>
-      <w:r>
-        <w:rPr>
-          <w:rFonts w:ascii="Segoe UI" w:hAnsi="Segoe UI"/>
-          <w:b/>
-          <w:i w:val="0"/>
-        </w:rPr>
-        <w:t>Rota</w:t>
-      </w:r>
-      <w:r>
-        <w:rPr>
-          <w:rFonts w:ascii="Segoe UI" w:hAnsi="Segoe UI"/>
-          <w:b w:val="0"/>
-          <w:i w:val="0"/>
-        </w:rPr>
-        <w:t>, os três obrigatórios: é ali que a caixa entra em circulação, e é a última hora em que dá para registrar quem levou e por onde. A rota tem sugestão das cadastradas, mas aceita qualquer nome digitado — carga sem rota é pior do que rota escrita à mão.</w:t>
+        <w:t>. É que a carga não vai direto ao cliente — ela sobe no caminhão, e é o caminhão que passa a guardar a caixa até a entrega. Depois, saindo da rota, aí sim você escolhe o cliente.</w:t>
       </w:r>
     </w:p>
     <w:p>

</xml_diff>

<commit_message>
Reordena os campos da saida na ordem em que se preenche
Data, Vai de, para onde, Motorista, Romaneio. O documento fica por ultimo por
ser o unico opcional. 'Sai de' virou 'Vai de', que faz par com 'Vai para a rota'.

Os dois campos de destino ocupam a mesma posicao no grid, ja que nunca aparecem
juntos: do galpao e a rota, da rota e o cliente.

Co-Authored-By: Claude Opus 5 (1M context) <noreply@anthropic.com>
</commit_message>
<xml_diff>
--- a/manual.docx
+++ b/manual.docx
@@ -1068,34 +1068,10 @@
       <w:r>
         <w:rPr>
           <w:rFonts w:ascii="Segoe UI" w:hAnsi="Segoe UI"/>
-          <w:b/>
-          <w:i w:val="0"/>
-        </w:rPr>
-        <w:t>Sai de</w:t>
-      </w:r>
-      <w:r>
-        <w:rPr>
-          <w:rFonts w:ascii="Segoe UI" w:hAnsi="Segoe UI"/>
           <w:b w:val="0"/>
           <w:i w:val="0"/>
         </w:rPr>
-        <w:t xml:space="preserve"> (galpão, filial ou rota), </w:t>
-      </w:r>
-      <w:r>
-        <w:rPr>
-          <w:rFonts w:ascii="Segoe UI" w:hAnsi="Segoe UI"/>
-          <w:b/>
-          <w:i w:val="0"/>
-        </w:rPr>
-        <w:t>Vai para</w:t>
-      </w:r>
-      <w:r>
-        <w:rPr>
-          <w:rFonts w:ascii="Segoe UI" w:hAnsi="Segoe UI"/>
-          <w:b w:val="0"/>
-          <w:i w:val="0"/>
-        </w:rPr>
-        <w:t xml:space="preserve"> (o cliente), a </w:t>
+        <w:t xml:space="preserve">Na ordem da tela: </w:t>
       </w:r>
       <w:r>
         <w:rPr>
@@ -1111,7 +1087,39 @@
           <w:b w:val="0"/>
           <w:i w:val="0"/>
         </w:rPr>
-        <w:t xml:space="preserve"> e, se houver, o número do </w:t>
+        <w:t xml:space="preserve">, </w:t>
+      </w:r>
+      <w:r>
+        <w:rPr>
+          <w:rFonts w:ascii="Segoe UI" w:hAnsi="Segoe UI"/>
+          <w:b/>
+          <w:i w:val="0"/>
+        </w:rPr>
+        <w:t>Vai de</w:t>
+      </w:r>
+      <w:r>
+        <w:rPr>
+          <w:rFonts w:ascii="Segoe UI" w:hAnsi="Segoe UI"/>
+          <w:b w:val="0"/>
+          <w:i w:val="0"/>
+        </w:rPr>
+        <w:t xml:space="preserve"> (galpão, filial ou rota), para onde, o </w:t>
+      </w:r>
+      <w:r>
+        <w:rPr>
+          <w:rFonts w:ascii="Segoe UI" w:hAnsi="Segoe UI"/>
+          <w:b/>
+          <w:i w:val="0"/>
+        </w:rPr>
+        <w:t>Motorista</w:t>
+      </w:r>
+      <w:r>
+        <w:rPr>
+          <w:rFonts w:ascii="Segoe UI" w:hAnsi="Segoe UI"/>
+          <w:b w:val="0"/>
+          <w:i w:val="0"/>
+        </w:rPr>
+        <w:t xml:space="preserve"> quando for carga do galpão, e o </w:t>
       </w:r>
       <w:r>
         <w:rPr>
@@ -1127,7 +1135,7 @@
           <w:b w:val="0"/>
           <w:i w:val="0"/>
         </w:rPr>
-        <w:t>.</w:t>
+        <w:t xml:space="preserve"> por último, que é o único opcional.</w:t>
       </w:r>
     </w:p>
     <w:p>

</xml_diff>

<commit_message>
Excluir usuario na lista, com trava para o ultimo admin
Mesma regra dos locais: so some de verdade quem nunca lancou nada. Quem ja tem
movimento -- ou responde por alguma rota -- e desativado, porque o nome de quem
contou e o que da peso a divergencia no historico.

Trava nova: o ultimo ADMIN ativo nao pode ser desativado nem excluido, nem por
ele mesmo. Como nao ha autorizacao no servidor, ficar sem admin so se resolveria
por SQL no banco.

Junto, ativo() ganha versao em _logica.js -- ate agora so existia no navegador.

Co-Authored-By: Claude Opus 5 (1M context) <noreply@anthropic.com>
</commit_message>
<xml_diff>
--- a/manual.docx
+++ b/manual.docx
@@ -2850,7 +2850,49 @@
           <w:b w:val="0"/>
           <w:i w:val="0"/>
         </w:rPr>
-        <w:t>, pelo botão na lista — não se apaga. O histórico de movimentos aponta para o usuário, e apagar deixaria lançamento órfão. Inativo some das listas e não consegue mais entrar; reativar devolve o acesso.</w:t>
+        <w:t xml:space="preserve">, pelo botão na lista. Existe também </w:t>
+      </w:r>
+      <w:r>
+        <w:rPr>
+          <w:rFonts w:ascii="Segoe UI" w:hAnsi="Segoe UI"/>
+          <w:b/>
+          <w:i w:val="0"/>
+        </w:rPr>
+        <w:t>excluir</w:t>
+      </w:r>
+      <w:r>
+        <w:rPr>
+          <w:rFonts w:ascii="Segoe UI" w:hAnsi="Segoe UI"/>
+          <w:b w:val="0"/>
+          <w:i w:val="0"/>
+        </w:rPr>
+        <w:t>, mas ele só apaga de verdade quem nunca lançou nada: quem já tem movimento no histórico é desativado, porque o nome de quem contou é o que dá peso à divergência. Inativo some das listas e não consegue mais entrar; reativar devolve o acesso.</w:t>
+      </w:r>
+    </w:p>
+    <w:p>
+      <w:r>
+        <w:rPr>
+          <w:rFonts w:ascii="Segoe UI" w:hAnsi="Segoe UI"/>
+          <w:b w:val="0"/>
+          <w:i w:val="0"/>
+        </w:rPr>
+        <w:t xml:space="preserve">O </w:t>
+      </w:r>
+      <w:r>
+        <w:rPr>
+          <w:rFonts w:ascii="Segoe UI" w:hAnsi="Segoe UI"/>
+          <w:b/>
+          <w:i w:val="0"/>
+        </w:rPr>
+        <w:t>último administrador ativo</w:t>
+      </w:r>
+      <w:r>
+        <w:rPr>
+          <w:rFonts w:ascii="Segoe UI" w:hAnsi="Segoe UI"/>
+          <w:b w:val="0"/>
+          <w:i w:val="0"/>
+        </w:rPr>
+        <w:t xml:space="preserve"> não pode ser desativado nem excluído — nem por ele mesmo. Sem ele ninguém entra no painel, e a volta seria por SQL no banco.</w:t>
       </w:r>
     </w:p>
     <w:p>

</xml_diff>

<commit_message>
Manual: secao de cadastro de motoristas
</commit_message>
<xml_diff>
--- a/manual.docx
+++ b/manual.docx
@@ -2757,6 +2757,76 @@
           <w:i w:val="0"/>
         </w:rPr>
         <w:t xml:space="preserve"> e avisa, porque apagar deixaria o histórico apontando para o vazio.</w:t>
+      </w:r>
+    </w:p>
+    <w:p>
+      <w:pPr>
+        <w:pStyle w:val="Heading2"/>
+      </w:pPr>
+      <w:r>
+        <w:t>Motoristas</w:t>
+      </w:r>
+    </w:p>
+    <w:p>
+      <w:r>
+        <w:rPr>
+          <w:rFonts w:ascii="Segoe UI" w:hAnsi="Segoe UI"/>
+          <w:b w:val="0"/>
+          <w:i w:val="0"/>
+        </w:rPr>
+        <w:t xml:space="preserve">Quem leva a carga, com telefone, CPF, número e categoria da </w:t>
+      </w:r>
+      <w:r>
+        <w:rPr>
+          <w:rFonts w:ascii="Segoe UI" w:hAnsi="Segoe UI"/>
+          <w:b/>
+          <w:i w:val="0"/>
+        </w:rPr>
+        <w:t>CNH</w:t>
+      </w:r>
+      <w:r>
+        <w:rPr>
+          <w:rFonts w:ascii="Segoe UI" w:hAnsi="Segoe UI"/>
+          <w:b w:val="0"/>
+          <w:i w:val="0"/>
+        </w:rPr>
+        <w:t>, validade e placa habitual. É essa lista que aparece para escolha na saída do galpão.</w:t>
+      </w:r>
+    </w:p>
+    <w:p>
+      <w:r>
+        <w:rPr>
+          <w:rFonts w:ascii="Segoe UI" w:hAnsi="Segoe UI"/>
+          <w:b w:val="0"/>
+          <w:i w:val="0"/>
+        </w:rPr>
+        <w:t xml:space="preserve">Cadastro separado dos </w:t>
+      </w:r>
+      <w:r>
+        <w:rPr>
+          <w:rFonts w:ascii="Segoe UI" w:hAnsi="Segoe UI"/>
+          <w:b w:val="0"/>
+          <w:i/>
+        </w:rPr>
+        <w:t>usuários</w:t>
+      </w:r>
+      <w:r>
+        <w:rPr>
+          <w:rFonts w:ascii="Segoe UI" w:hAnsi="Segoe UI"/>
+          <w:b w:val="0"/>
+          <w:i w:val="0"/>
+        </w:rPr>
+        <w:t xml:space="preserve"> de propósito: motorista é quem dirige, não quem usa o app. A maioria nunca vai fazer login, e criar conta com PIN para cada um seria inventar senha que ninguém usa.</w:t>
+      </w:r>
+    </w:p>
+    <w:p>
+      <w:r>
+        <w:rPr>
+          <w:rFonts w:ascii="Segoe UI" w:hAnsi="Segoe UI"/>
+          <w:b w:val="0"/>
+          <w:i w:val="0"/>
+        </w:rPr>
+        <w:t>A validade da CNH aparece em vermelho quando está vencida. O app não bloqueia a saída por isso — só mostra, para o escritório resolver.</w:t>
       </w:r>
     </w:p>
     <w:p>

</xml_diff>

<commit_message>
Local padrao vira cadastro proprio; tabela de locais enxuta; botao Nova rota
Locais e rotas: a tabela mostra so nome, tipo e ativo. Rota, responsavel,
whatsapp, limite e prazo continuam no formulario -- na lista eram sete colunas
de traco, porque quase nenhuma vale para rota. O botao virou 'Nova rota' e o
formulario ja abre nesse tipo, que e o cadastro mais frequente agora.

Local padrao ganha tabela propria. Sao coisas diferentes: locais guardam caixa e
tem saldo; local padrao e o posto de trabalho de alguem, e um escritorio nunca
vai segurar caixa. A migracao copia os galpoes e filiais existentes mantendo o
id, entao ninguem perde o vinculo.

Consequencia assumida: o local padrao deixa de pre-selecionar a origem na tela de
saida, porque nao e mais um no com saldo. Quem faz isso agora e a rota escolhida.

Excluir local padrao em uso e recusado, dizendo quantos usuarios dependem dele.

Co-Authored-By: Claude Opus 5 (1M context) <noreply@anthropic.com>
</commit_message>
<xml_diff>
--- a/manual.docx
+++ b/manual.docx
@@ -2757,6 +2757,98 @@
           <w:i w:val="0"/>
         </w:rPr>
         <w:t xml:space="preserve"> e avisa, porque apagar deixaria o histórico apontando para o vazio.</w:t>
+      </w:r>
+    </w:p>
+    <w:p>
+      <w:pPr>
+        <w:pStyle w:val="Heading2"/>
+      </w:pPr>
+      <w:r>
+        <w:t>Locais padrão</w:t>
+      </w:r>
+    </w:p>
+    <w:p>
+      <w:r>
+        <w:rPr>
+          <w:rFonts w:ascii="Segoe UI" w:hAnsi="Segoe UI"/>
+          <w:b w:val="0"/>
+          <w:i w:val="0"/>
+        </w:rPr>
+        <w:t xml:space="preserve">Onde a pessoa trabalha — </w:t>
+      </w:r>
+      <w:r>
+        <w:rPr>
+          <w:rFonts w:ascii="Segoe UI" w:hAnsi="Segoe UI"/>
+          <w:b w:val="0"/>
+          <w:i/>
+        </w:rPr>
+        <w:t>Escritório Central</w:t>
+      </w:r>
+      <w:r>
+        <w:rPr>
+          <w:rFonts w:ascii="Segoe UI" w:hAnsi="Segoe UI"/>
+          <w:b w:val="0"/>
+          <w:i w:val="0"/>
+        </w:rPr>
+        <w:t xml:space="preserve">, </w:t>
+      </w:r>
+      <w:r>
+        <w:rPr>
+          <w:rFonts w:ascii="Segoe UI" w:hAnsi="Segoe UI"/>
+          <w:b w:val="0"/>
+          <w:i/>
+        </w:rPr>
+        <w:t>Base Recife</w:t>
+      </w:r>
+      <w:r>
+        <w:rPr>
+          <w:rFonts w:ascii="Segoe UI" w:hAnsi="Segoe UI"/>
+          <w:b w:val="0"/>
+          <w:i w:val="0"/>
+        </w:rPr>
+        <w:t xml:space="preserve">. É o que aparece na coluna </w:t>
+      </w:r>
+      <w:r>
+        <w:rPr>
+          <w:rFonts w:ascii="Segoe UI" w:hAnsi="Segoe UI"/>
+          <w:b/>
+          <w:i w:val="0"/>
+        </w:rPr>
+        <w:t>Local padrão</w:t>
+      </w:r>
+      <w:r>
+        <w:rPr>
+          <w:rFonts w:ascii="Segoe UI" w:hAnsi="Segoe UI"/>
+          <w:b w:val="0"/>
+          <w:i w:val="0"/>
+        </w:rPr>
+        <w:t xml:space="preserve"> dos usuários.</w:t>
+      </w:r>
+    </w:p>
+    <w:p>
+      <w:r>
+        <w:rPr>
+          <w:rFonts w:ascii="Segoe UI" w:hAnsi="Segoe UI"/>
+          <w:b w:val="0"/>
+          <w:i w:val="0"/>
+        </w:rPr>
+        <w:t xml:space="preserve">Repare que é um cadastro </w:t>
+      </w:r>
+      <w:r>
+        <w:rPr>
+          <w:rFonts w:ascii="Segoe UI" w:hAnsi="Segoe UI"/>
+          <w:b/>
+          <w:i w:val="0"/>
+        </w:rPr>
+        <w:t>diferente</w:t>
+      </w:r>
+      <w:r>
+        <w:rPr>
+          <w:rFonts w:ascii="Segoe UI" w:hAnsi="Segoe UI"/>
+          <w:b w:val="0"/>
+          <w:i w:val="0"/>
+        </w:rPr>
+        <w:t xml:space="preserve"> de Locais e rotas. Lá ficam os nós que guardam caixa e têm saldo; aqui é só o posto de trabalho. Um escritório nunca vai segurar caixa, mas é onde alguém fica.</w:t>
       </w:r>
     </w:p>
     <w:p>

</xml_diff>

<commit_message>
Tira a barra Rota de hoje e o Romaneio da saida
Com a barra sai o filtro de clientes por rota e o pre-preenchimento de origem e
destino: os seletores voltam a listar tudo, e a escolha e feita em cada tela. As
rotas continuam nos seletores, porque o caminhao e origem da entrega e destino da
coleta.

Removi junto o que so existia para a barra -- rotasDisponiveis, clientesDaRota,
atualizarResumoRota e a rota guardada no aparelho.

Romaneio sai so da Saida; na Devolucao continua.

Co-Authored-By: Claude Opus 5 (1M context) <noreply@anthropic.com>
</commit_message>
<xml_diff>
--- a/manual.docx
+++ b/manual.docx
@@ -613,15 +613,15 @@
           <w:b w:val="0"/>
           <w:i w:val="0"/>
         </w:rPr>
-        <w:t xml:space="preserve">Quem tem rota vinculada vê </w:t>
+        <w:t xml:space="preserve">As rotas aparecem nos seletores de </w:t>
       </w:r>
       <w:r>
         <w:rPr>
           <w:rFonts w:ascii="Segoe UI" w:hAnsi="Segoe UI"/>
-          <w:b/>
-          <w:i w:val="0"/>
-        </w:rPr>
-        <w:t>Rota de hoje</w:t>
+          <w:b w:val="0"/>
+          <w:i/>
+        </w:rPr>
+        <w:t>Vai de</w:t>
       </w:r>
       <w:r>
         <w:rPr>
@@ -629,7 +629,7 @@
           <w:b w:val="0"/>
           <w:i w:val="0"/>
         </w:rPr>
-        <w:t xml:space="preserve"> no topo. Escolhida a rota, </w:t>
+        <w:t xml:space="preserve"> e </w:t>
       </w:r>
       <w:r>
         <w:rPr>
@@ -637,7 +637,7 @@
           <w:b w:val="0"/>
           <w:i/>
         </w:rPr>
-        <w:t>Sai de</w:t>
+        <w:t>Recebidas em</w:t>
       </w:r>
       <w:r>
         <w:rPr>
@@ -645,23 +645,7 @@
           <w:b w:val="0"/>
           <w:i w:val="0"/>
         </w:rPr>
-        <w:t xml:space="preserve"> e </w:t>
-      </w:r>
-      <w:r>
-        <w:rPr>
-          <w:rFonts w:ascii="Segoe UI" w:hAnsi="Segoe UI"/>
-          <w:b w:val="0"/>
-          <w:i/>
-        </w:rPr>
-        <w:t>Recebidas em</w:t>
-      </w:r>
-      <w:r>
-        <w:rPr>
-          <w:rFonts w:ascii="Segoe UI" w:hAnsi="Segoe UI"/>
-          <w:b w:val="0"/>
-          <w:i w:val="0"/>
-        </w:rPr>
-        <w:t xml:space="preserve"> já vêm com o caminhão, e a lista de clientes fica só com os pontos daquela rota. A escolha fica salva no aparelho — não precisa repetir a cada tela.</w:t>
+        <w:t>, ao lado dos galpões e filiais — o caminhão é origem da entrega e destino da coleta. A escolha é feita em cada tela.</w:t>
       </w:r>
     </w:p>
     <w:p>
@@ -1103,7 +1087,7 @@
           <w:b w:val="0"/>
           <w:i w:val="0"/>
         </w:rPr>
-        <w:t xml:space="preserve"> (galpão, filial ou rota), para onde, o </w:t>
+        <w:t xml:space="preserve"> (galpão, filial ou rota), para onde, e o </w:t>
       </w:r>
       <w:r>
         <w:rPr>
@@ -1119,23 +1103,7 @@
           <w:b w:val="0"/>
           <w:i w:val="0"/>
         </w:rPr>
-        <w:t xml:space="preserve"> quando for carga do galpão, e o </w:t>
-      </w:r>
-      <w:r>
-        <w:rPr>
-          <w:rFonts w:ascii="Segoe UI" w:hAnsi="Segoe UI"/>
-          <w:b/>
-          <w:i w:val="0"/>
-        </w:rPr>
-        <w:t>Romaneio / NF</w:t>
-      </w:r>
-      <w:r>
-        <w:rPr>
-          <w:rFonts w:ascii="Segoe UI" w:hAnsi="Segoe UI"/>
-          <w:b w:val="0"/>
-          <w:i w:val="0"/>
-        </w:rPr>
-        <w:t xml:space="preserve"> por último, que é o único opcional.</w:t>
+        <w:t xml:space="preserve"> quando for carga do galpão.</w:t>
       </w:r>
     </w:p>
     <w:p>

</xml_diff>

<commit_message>
Redefinição de senha sem e-mail: pedido que o escritório atende
Quem tem PIN ou a senha antiga já se resolvia sozinho na tela. Quem não tem
nenhum dos dois ficava sem saída — e como o app não envia e-mail, prometer
"link de redefinição" seria promessa falsa.

O pedido vira uma linha em `pedidos_senha`, aparece em Cadastros → Pedidos de
senha com o usuário correspondente (ou "não encontrado"), e o admin cadastra a
senha nova à mão e marca como resolvido.

`pedirSenha` responde sempre a mesma coisa, exista o identificador ou não, e
ignora repetição: diferenciar transformaria a tela de login pública num
listório de quem trabalha aqui.

Manual, PDF e Word atualizados — incluindo por que o campo usa PIN e o painel
usa senha, que era pergunta recorrente. 7 testes novos, 145 no total.

Co-Authored-By: Claude Opus 5 <noreply@anthropic.com>
</commit_message>
<xml_diff>
--- a/manual.docx
+++ b/manual.docx
@@ -822,7 +822,7 @@
           <w:color w:val="3E4C58"/>
           <w:sz w:val="19"/>
         </w:rPr>
-        <w:t>Escolhe o nome na lista, digita o PIN, entra.</w:t>
+        <w:t>Escreve o nome e o PIN de 4 dígitos. Sem lista de nomes na tela.</w:t>
       </w:r>
     </w:p>
     <w:p>
@@ -868,7 +868,7 @@
           <w:color w:val="3E4C58"/>
           <w:sz w:val="19"/>
         </w:rPr>
-        <w:t>Mesmo login, com usuário de perfil ADMIN.</w:t>
+        <w:t>E-mail ou usuário, mais senha. Só perfil ADMIN e GALPÃO entram.</w:t>
       </w:r>
     </w:p>
     <w:p>
@@ -916,6 +916,188 @@
         </w:rPr>
         <w:t>Abre direto, sem login e sem senha. Cada cliente tem o seu código.</w:t>
       </w:r>
+    </w:p>
+    <w:p>
+      <w:pPr>
+        <w:pStyle w:val="Heading2"/>
+      </w:pPr>
+      <w:r>
+        <w:t>Por que o campo usa PIN e o escritório usa senha</w:t>
+      </w:r>
+    </w:p>
+    <w:p>
+      <w:r>
+        <w:rPr>
+          <w:rFonts w:ascii="Segoe UI" w:hAnsi="Segoe UI"/>
+          <w:b w:val="0"/>
+          <w:i w:val="0"/>
+        </w:rPr>
+        <w:t>Não é descuido: são dois usos diferentes. No galpão a pessoa lança de luva, com o celular numa mão e a caixa na outra, várias vezes por dia — digitar uma senha longa a cada vez atrasa a operação, e o que o PIN protege é só lançamento, que fica registrado com nome e hora e pode ser corrigido. Já o painel vê a operação inteira e mexe em cadastro; ali a senha longa se paga.</w:t>
+      </w:r>
+    </w:p>
+    <w:p>
+      <w:pPr>
+        <w:pStyle w:val="Heading2"/>
+      </w:pPr>
+      <w:r>
+        <w:t>Esqueci a senha do painel</w:t>
+      </w:r>
+    </w:p>
+    <w:p>
+      <w:r>
+        <w:rPr>
+          <w:rFonts w:ascii="Segoe UI" w:hAnsi="Segoe UI"/>
+          <w:b w:val="0"/>
+          <w:i w:val="0"/>
+        </w:rPr>
+        <w:t xml:space="preserve">Na tela de entrada, clique em </w:t>
+      </w:r>
+      <w:r>
+        <w:rPr>
+          <w:rFonts w:ascii="Segoe UI" w:hAnsi="Segoe UI"/>
+          <w:b/>
+          <w:i w:val="0"/>
+        </w:rPr>
+        <w:t>Primeiro acesso ou esqueci a senha</w:t>
+      </w:r>
+      <w:r>
+        <w:rPr>
+          <w:rFonts w:ascii="Segoe UI" w:hAnsi="Segoe UI"/>
+          <w:b w:val="0"/>
+          <w:i w:val="0"/>
+        </w:rPr>
+        <w:t xml:space="preserve">. Quem ainda nunca definiu senha prova quem é pelo </w:t>
+      </w:r>
+      <w:r>
+        <w:rPr>
+          <w:rFonts w:ascii="Segoe UI" w:hAnsi="Segoe UI"/>
+          <w:b/>
+          <w:i w:val="0"/>
+        </w:rPr>
+        <w:t>PIN</w:t>
+      </w:r>
+      <w:r>
+        <w:rPr>
+          <w:rFonts w:ascii="Segoe UI" w:hAnsi="Segoe UI"/>
+          <w:b w:val="0"/>
+          <w:i w:val="0"/>
+        </w:rPr>
+        <w:t xml:space="preserve">; quem já tem senha informa a </w:t>
+      </w:r>
+      <w:r>
+        <w:rPr>
+          <w:rFonts w:ascii="Segoe UI" w:hAnsi="Segoe UI"/>
+          <w:b/>
+          <w:i w:val="0"/>
+        </w:rPr>
+        <w:t>senha atual</w:t>
+      </w:r>
+      <w:r>
+        <w:rPr>
+          <w:rFonts w:ascii="Segoe UI" w:hAnsi="Segoe UI"/>
+          <w:b w:val="0"/>
+          <w:i w:val="0"/>
+        </w:rPr>
+        <w:t>. Nos dois casos a nova senha vale na hora.</w:t>
+      </w:r>
+    </w:p>
+    <w:p>
+      <w:r>
+        <w:rPr>
+          <w:rFonts w:ascii="Segoe UI" w:hAnsi="Segoe UI"/>
+          <w:b w:val="0"/>
+          <w:i w:val="0"/>
+        </w:rPr>
+        <w:t xml:space="preserve">Quem não tem nem um nem outro clica em </w:t>
+      </w:r>
+      <w:r>
+        <w:rPr>
+          <w:rFonts w:ascii="Segoe UI" w:hAnsi="Segoe UI"/>
+          <w:b/>
+          <w:i w:val="0"/>
+        </w:rPr>
+        <w:t>Pedir ajuda ao escritório</w:t>
+      </w:r>
+      <w:r>
+        <w:rPr>
+          <w:rFonts w:ascii="Segoe UI" w:hAnsi="Segoe UI"/>
+          <w:b w:val="0"/>
+          <w:i w:val="0"/>
+        </w:rPr>
+        <w:t xml:space="preserve">. O pedido aparece no painel, em </w:t>
+      </w:r>
+      <w:r>
+        <w:rPr>
+          <w:rFonts w:ascii="Segoe UI" w:hAnsi="Segoe UI"/>
+          <w:b/>
+          <w:i w:val="0"/>
+        </w:rPr>
+        <w:t>Cadastros → Pedidos de senha</w:t>
+      </w:r>
+      <w:r>
+        <w:rPr>
+          <w:rFonts w:ascii="Segoe UI" w:hAnsi="Segoe UI"/>
+          <w:b w:val="0"/>
+          <w:i w:val="0"/>
+        </w:rPr>
+        <w:t xml:space="preserve">, e o administrador cadastra uma senha nova em Usuários. </w:t>
+      </w:r>
+      <w:r>
+        <w:rPr>
+          <w:rFonts w:ascii="Segoe UI" w:hAnsi="Segoe UI"/>
+          <w:b w:val="0"/>
+          <w:i/>
+        </w:rPr>
+        <w:t>O app não envia e-mail</w:t>
+      </w:r>
+      <w:r>
+        <w:rPr>
+          <w:rFonts w:ascii="Segoe UI" w:hAnsi="Segoe UI"/>
+          <w:b w:val="0"/>
+          <w:i w:val="0"/>
+        </w:rPr>
+        <w:t xml:space="preserve"> — a senha nova é combinada pessoalmente, e depois disso o administrador marca o pedido como resolvido.</w:t>
+      </w:r>
+    </w:p>
+    <w:p>
+      <w:pPr>
+        <w:spacing w:after="40"/>
+        <w:pBdr>
+          <w:left w:val="single" w:sz="18" w:space="8" w:color="D9A300"/>
+        </w:pBdr>
+        <w:shd w:val="clear" w:fill="FFF8E6"/>
+      </w:pPr>
+      <w:r>
+        <w:rPr>
+          <w:rFonts w:ascii="Segoe UI" w:hAnsi="Segoe UI"/>
+          <w:b/>
+          <w:color w:val="8A6100"/>
+          <w:sz w:val="16"/>
+        </w:rPr>
+        <w:t>POR QUE NÃO DIZ SE O E-MAIL EXISTE</w:t>
+      </w:r>
+    </w:p>
+    <w:p>
+      <w:pPr>
+        <w:spacing w:after="80"/>
+        <w:pBdr>
+          <w:left w:val="single" w:sz="18" w:space="8" w:color="D9A300"/>
+        </w:pBdr>
+        <w:shd w:val="clear" w:fill="FFF8E6"/>
+      </w:pPr>
+      <w:r>
+        <w:rPr>
+          <w:rFonts w:ascii="Segoe UI" w:hAnsi="Segoe UI"/>
+          <w:b w:val="0"/>
+          <w:i w:val="0"/>
+        </w:rPr>
+        <w:t>O pedido responde a mesma coisa para qualquer texto digitado. Se dissesse “esse e-mail não existe”, qualquer pessoa poderia usar a tela para descobrir quem trabalha aqui.</w:t>
+      </w:r>
+    </w:p>
+    <w:p>
+      <w:pPr>
+        <w:spacing w:after="40"/>
+      </w:pPr>
     </w:p>
     <w:p>
       <w:pPr>
@@ -2954,7 +3136,7 @@
           <w:b w:val="0"/>
           <w:i w:val="0"/>
         </w:rPr>
-        <w:t>Nome, perfil, PIN e local padrão. Um PIN por pessoa, nunca um PIN de função compartilhado entre vários: é o nome de quem contou que dá peso à divergência.</w:t>
+        <w:t>Nome, e-mail, perfil, PIN e local padrão. O e-mail (ou o usuário) é o que a pessoa digita para entrar no painel; o PIN é o do celular. Um PIN por pessoa, nunca um PIN de função compartilhado entre vários: é o nome de quem contou que dá peso à divergência.</w:t>
       </w:r>
     </w:p>
     <w:p>
@@ -2997,6 +3179,72 @@
           <w:i w:val="0"/>
         </w:rPr>
         <w:t>, mas ele só apaga de verdade quem nunca lançou nada: quem já tem movimento no histórico é desativado, porque o nome de quem contou é o que dá peso à divergência. Inativo some das listas e não consegue mais entrar; reativar devolve o acesso.</w:t>
+      </w:r>
+    </w:p>
+    <w:p>
+      <w:pPr>
+        <w:pStyle w:val="Heading2"/>
+      </w:pPr>
+      <w:r>
+        <w:t>Pedidos de senha</w:t>
+      </w:r>
+    </w:p>
+    <w:p>
+      <w:r>
+        <w:rPr>
+          <w:rFonts w:ascii="Segoe UI" w:hAnsi="Segoe UI"/>
+          <w:b w:val="0"/>
+          <w:i w:val="0"/>
+        </w:rPr>
+        <w:t xml:space="preserve">Este cartão só aparece quando alguém pediu ajuda para entrar no painel. Cada linha mostra o que a pessoa digitou, quando pediu e a qual usuário aquilo corresponde — ou </w:t>
+      </w:r>
+      <w:r>
+        <w:rPr>
+          <w:rFonts w:ascii="Segoe UI" w:hAnsi="Segoe UI"/>
+          <w:b w:val="0"/>
+          <w:i/>
+        </w:rPr>
+        <w:t>não encontrado</w:t>
+      </w:r>
+      <w:r>
+        <w:rPr>
+          <w:rFonts w:ascii="Segoe UI" w:hAnsi="Segoe UI"/>
+          <w:b w:val="0"/>
+          <w:i w:val="0"/>
+        </w:rPr>
+        <w:t xml:space="preserve">, se não corresponder a ninguém cadastrado. Cadastre a senha nova em </w:t>
+      </w:r>
+      <w:r>
+        <w:rPr>
+          <w:rFonts w:ascii="Segoe UI" w:hAnsi="Segoe UI"/>
+          <w:b/>
+          <w:i w:val="0"/>
+        </w:rPr>
+        <w:t>Usuários</w:t>
+      </w:r>
+      <w:r>
+        <w:rPr>
+          <w:rFonts w:ascii="Segoe UI" w:hAnsi="Segoe UI"/>
+          <w:b w:val="0"/>
+          <w:i w:val="0"/>
+        </w:rPr>
+        <w:t xml:space="preserve">, avise a pessoa e depois clique em </w:t>
+      </w:r>
+      <w:r>
+        <w:rPr>
+          <w:rFonts w:ascii="Segoe UI" w:hAnsi="Segoe UI"/>
+          <w:b/>
+          <w:i w:val="0"/>
+        </w:rPr>
+        <w:t>marcar resolvido</w:t>
+      </w:r>
+      <w:r>
+        <w:rPr>
+          <w:rFonts w:ascii="Segoe UI" w:hAnsi="Segoe UI"/>
+          <w:b w:val="0"/>
+          <w:i w:val="0"/>
+        </w:rPr>
+        <w:t>.</w:t>
       </w:r>
     </w:p>
     <w:p>

</xml_diff>

<commit_message>
Motorista pode ser ativado e desativado, como usuário e local
Faltava o meio-termo: só havia excluir. Quem sai da empresa agora é desativado
— some da escolha de motorista na saída do galpão (a rota pública já filtrava
por ativo), mas o nome continua legível no cadastro e nas cargas que já levou.

O backend já aceitava Ativo em salvarMotorista; era só a interface que não
oferecia. O teste novo cobre o que o botão depende de verdade: mandar só
{ID, Ativo} não pode apagar CPF, CNH e placa em silêncio.

148 verificações. Manual, PDF e Word atualizados.

Co-Authored-By: Claude Opus 5 <noreply@anthropic.com>
</commit_message>
<xml_diff>
--- a/manual.docx
+++ b/manual.docx
@@ -3033,6 +3033,48 @@
           <w:i w:val="0"/>
         </w:rPr>
         <w:t>, validade e placa habitual. É essa lista que aparece para escolha na saída do galpão.</w:t>
+      </w:r>
+    </w:p>
+    <w:p>
+      <w:r>
+        <w:rPr>
+          <w:rFonts w:ascii="Segoe UI" w:hAnsi="Segoe UI"/>
+          <w:b w:val="0"/>
+          <w:i w:val="0"/>
+        </w:rPr>
+        <w:t xml:space="preserve">Quem sai da empresa se </w:t>
+      </w:r>
+      <w:r>
+        <w:rPr>
+          <w:rFonts w:ascii="Segoe UI" w:hAnsi="Segoe UI"/>
+          <w:b/>
+          <w:i w:val="0"/>
+        </w:rPr>
+        <w:t>desativa</w:t>
+      </w:r>
+      <w:r>
+        <w:rPr>
+          <w:rFonts w:ascii="Segoe UI" w:hAnsi="Segoe UI"/>
+          <w:b w:val="0"/>
+          <w:i w:val="0"/>
+        </w:rPr>
+        <w:t xml:space="preserve"> pelo botão na lista: ele some da escolha de motorista na saída do galpão, mas o nome continua legível no cadastro e nas cargas que já levou. </w:t>
+      </w:r>
+      <w:r>
+        <w:rPr>
+          <w:rFonts w:ascii="Segoe UI" w:hAnsi="Segoe UI"/>
+          <w:b/>
+          <w:i w:val="0"/>
+        </w:rPr>
+        <w:t>Excluir</w:t>
+      </w:r>
+      <w:r>
+        <w:rPr>
+          <w:rFonts w:ascii="Segoe UI" w:hAnsi="Segoe UI"/>
+          <w:b w:val="0"/>
+          <w:i w:val="0"/>
+        </w:rPr>
+        <w:t xml:space="preserve"> apaga de vez — use só para quem foi cadastrado errado.</w:t>
       </w:r>
     </w:p>
     <w:p>

</xml_diff>

<commit_message>
Usuários abre os Cadastros; "Saída" e "Destino" na tela de saída
Usuários era o último cartão, depois de cinco outros — é o que mais se mexe no
dia a dia e obrigava a rolar a página inteira. Agora é o primeiro. Pedidos de
senha continua acima porque é aviso, não cadastro, e só aparece quando há
pedido pendente.

Na saída: "Vai de" virou "Saída" e "Vai para a rota" virou "Destino". O campo de
cliente já se chamava "Vai para" e virou "Destino" também — os dois nunca
aparecem juntos, então o rótulo único deixa de anunciar uma diferença que a
pessoa não precisa entender para preencher.

Manual, PDF e Word acompanham.

Co-Authored-By: Claude Opus 5 <noreply@anthropic.com>
</commit_message>
<xml_diff>
--- a/manual.docx
+++ b/manual.docx
@@ -621,7 +621,7 @@
           <w:b w:val="0"/>
           <w:i/>
         </w:rPr>
-        <w:t>Vai de</w:t>
+        <w:t>Saída</w:t>
       </w:r>
       <w:r>
         <w:rPr>
@@ -1261,7 +1261,7 @@
           <w:b/>
           <w:i w:val="0"/>
         </w:rPr>
-        <w:t>Vai de</w:t>
+        <w:t>Saída</w:t>
       </w:r>
       <w:r>
         <w:rPr>
@@ -1269,7 +1269,23 @@
           <w:b w:val="0"/>
           <w:i w:val="0"/>
         </w:rPr>
-        <w:t xml:space="preserve"> (galpão, filial ou rota), para onde, e o </w:t>
+        <w:t xml:space="preserve"> (galpão, filial ou rota), </w:t>
+      </w:r>
+      <w:r>
+        <w:rPr>
+          <w:rFonts w:ascii="Segoe UI" w:hAnsi="Segoe UI"/>
+          <w:b/>
+          <w:i w:val="0"/>
+        </w:rPr>
+        <w:t>Destino</w:t>
+      </w:r>
+      <w:r>
+        <w:rPr>
+          <w:rFonts w:ascii="Segoe UI" w:hAnsi="Segoe UI"/>
+          <w:b w:val="0"/>
+          <w:i w:val="0"/>
+        </w:rPr>
+        <w:t xml:space="preserve">, e o </w:t>
       </w:r>
       <w:r>
         <w:rPr>
@@ -1315,7 +1331,23 @@
           <w:b w:val="0"/>
           <w:i w:val="0"/>
         </w:rPr>
-        <w:t xml:space="preserve"> a tela muda: no lugar de </w:t>
+        <w:t xml:space="preserve"> a tela muda: o </w:t>
+      </w:r>
+      <w:r>
+        <w:rPr>
+          <w:rFonts w:ascii="Segoe UI" w:hAnsi="Segoe UI"/>
+          <w:b/>
+          <w:i w:val="0"/>
+        </w:rPr>
+        <w:t>Destino</w:t>
+      </w:r>
+      <w:r>
+        <w:rPr>
+          <w:rFonts w:ascii="Segoe UI" w:hAnsi="Segoe UI"/>
+          <w:b w:val="0"/>
+          <w:i w:val="0"/>
+        </w:rPr>
+        <w:t xml:space="preserve"> passa a listar as </w:t>
       </w:r>
       <w:r>
         <w:rPr>
@@ -1323,7 +1355,7 @@
           <w:b w:val="0"/>
           <w:i/>
         </w:rPr>
-        <w:t>Vai para</w:t>
+        <w:t>rotas</w:t>
       </w:r>
       <w:r>
         <w:rPr>
@@ -1331,23 +1363,7 @@
           <w:b w:val="0"/>
           <w:i w:val="0"/>
         </w:rPr>
-        <w:t xml:space="preserve"> aparece </w:t>
-      </w:r>
-      <w:r>
-        <w:rPr>
-          <w:rFonts w:ascii="Segoe UI" w:hAnsi="Segoe UI"/>
-          <w:b/>
-          <w:i w:val="0"/>
-        </w:rPr>
-        <w:t>Vai para a rota</w:t>
-      </w:r>
-      <w:r>
-        <w:rPr>
-          <w:rFonts w:ascii="Segoe UI" w:hAnsi="Segoe UI"/>
-          <w:b w:val="0"/>
-          <w:i w:val="0"/>
-        </w:rPr>
-        <w:t xml:space="preserve">, mais o </w:t>
+        <w:t xml:space="preserve"> em vez dos clientes, e aparece o </w:t>
       </w:r>
       <w:r>
         <w:rPr>

</xml_diff>

<commit_message>
Motorista vira lista fechada, sem digitar
Era input com sugestão. O comentário no código dizia "sugestão, não trava: um
motorista de fora pode cobrir a rota num dia qualquer" — o usuário pediu o
contrário, e tem razão pelo lado do dado: nome digitado à mão vira "Valcy" e
"valci", e o extrato mostra duas pessoas onde há uma.

Trocar de galpão não apaga quem já foi escolhido: a remontagem do select
preserva a seleção.

Lista fechada cria um beco que o campo aberto não tinha — sem motorista ativo
ninguém consegue lançar. A validação detecta e diz onde resolver, em vez de só
repetir "escolha o motorista".

Manual, PDF e Word acompanham, incluindo que cadastrar motorista virou
pré-requisito da saída do galpão.

Co-Authored-By: Claude Opus 5 <noreply@anthropic.com>
</commit_message>
<xml_diff>
--- a/manual.docx
+++ b/manual.docx
@@ -1380,6 +1380,52 @@
           <w:i w:val="0"/>
         </w:rPr>
         <w:t>. É que a carga não vai direto ao cliente — ela sobe no caminhão, e é o caminhão que passa a guardar a caixa até a entrega. Depois, saindo da rota, aí sim você escolhe o cliente.</w:t>
+      </w:r>
+    </w:p>
+    <w:p>
+      <w:pPr>
+        <w:spacing w:after="120"/>
+        <w:ind w:left="907"/>
+      </w:pPr>
+      <w:r>
+        <w:rPr>
+          <w:rFonts w:ascii="Segoe UI" w:hAnsi="Segoe UI"/>
+          <w:b w:val="0"/>
+          <w:i w:val="0"/>
+        </w:rPr>
+        <w:t xml:space="preserve">O </w:t>
+      </w:r>
+      <w:r>
+        <w:rPr>
+          <w:rFonts w:ascii="Segoe UI" w:hAnsi="Segoe UI"/>
+          <w:b/>
+          <w:i w:val="0"/>
+        </w:rPr>
+        <w:t>Motorista</w:t>
+      </w:r>
+      <w:r>
+        <w:rPr>
+          <w:rFonts w:ascii="Segoe UI" w:hAnsi="Segoe UI"/>
+          <w:b w:val="0"/>
+          <w:i w:val="0"/>
+        </w:rPr>
+        <w:t xml:space="preserve"> é lista fechada, não campo de digitar: nome escrito à mão vira grafia diferente do mesmo motorista, e o extrato passa a mostrar duas pessoas onde há uma. Quem vai levar a carga e não aparece na lista precisa ser cadastrado antes, em </w:t>
+      </w:r>
+      <w:r>
+        <w:rPr>
+          <w:rFonts w:ascii="Segoe UI" w:hAnsi="Segoe UI"/>
+          <w:b/>
+          <w:i w:val="0"/>
+        </w:rPr>
+        <w:t>Cadastros → Motoristas</w:t>
+      </w:r>
+      <w:r>
+        <w:rPr>
+          <w:rFonts w:ascii="Segoe UI" w:hAnsi="Segoe UI"/>
+          <w:b w:val="0"/>
+          <w:i w:val="0"/>
+        </w:rPr>
+        <w:t>.</w:t>
       </w:r>
     </w:p>
     <w:p>
@@ -3049,6 +3095,32 @@
           <w:i w:val="0"/>
         </w:rPr>
         <w:t>, validade e placa habitual. É essa lista que aparece para escolha na saída do galpão.</w:t>
+      </w:r>
+    </w:p>
+    <w:p>
+      <w:r>
+        <w:rPr>
+          <w:rFonts w:ascii="Segoe UI" w:hAnsi="Segoe UI"/>
+          <w:b w:val="0"/>
+          <w:i w:val="0"/>
+        </w:rPr>
+        <w:t xml:space="preserve">Cadastrar aqui é </w:t>
+      </w:r>
+      <w:r>
+        <w:rPr>
+          <w:rFonts w:ascii="Segoe UI" w:hAnsi="Segoe UI"/>
+          <w:b/>
+          <w:i w:val="0"/>
+        </w:rPr>
+        <w:t>pré-requisito para a saída do galpão</w:t>
+      </w:r>
+      <w:r>
+        <w:rPr>
+          <w:rFonts w:ascii="Segoe UI" w:hAnsi="Segoe UI"/>
+          <w:b w:val="0"/>
+          <w:i w:val="0"/>
+        </w:rPr>
+        <w:t>: no celular o motorista se escolhe numa lista fechada, e quem não estiver cadastrado não pode ser lançado.</w:t>
       </w:r>
     </w:p>
     <w:p>

</xml_diff>

<commit_message>
Cadastros: cada quadro abre e fecha no clique do título
Seis cadastros abertos ao mesmo tempo deixavam o que a pessoa procura a três
rolagens de distância — só Motoristas são onze linhas. Agora começam fechados e
a aba vira índice.

O número ao lado do nome diz quantos itens há dentro: sem ele, quadro fechado e
cadastro vazio ficam iguais na tela. O estado de cada um fica guardado no
navegador, então o que você abriu continua aberto na volta.

Pedidos de senha é a exceção que já nasce aberto — é aviso, não cadastro, e só
aparece quando há pedido pendente.

O miolo é envolvido por código, não na marcação: cada quadro é reescrito por
innerHTML a cada salvamento, e envolver na mão seriam seis lugares para
esquecer um. Verificado por imagem, com a marcação real dos seis quadros.

Co-Authored-By: Claude Opus 5 <noreply@anthropic.com>
</commit_message>
<xml_diff>
--- a/manual.docx
+++ b/manual.docx
@@ -3249,6 +3249,32 @@
           <w:i w:val="0"/>
         </w:rPr>
         <w:t>. Mantenha a lista curta — ela é escolhida no celular, com pressa.</w:t>
+      </w:r>
+    </w:p>
+    <w:p>
+      <w:r>
+        <w:rPr>
+          <w:rFonts w:ascii="Segoe UI" w:hAnsi="Segoe UI"/>
+          <w:b w:val="0"/>
+          <w:i w:val="0"/>
+        </w:rPr>
+        <w:t xml:space="preserve">Cada quadro desta aba </w:t>
+      </w:r>
+      <w:r>
+        <w:rPr>
+          <w:rFonts w:ascii="Segoe UI" w:hAnsi="Segoe UI"/>
+          <w:b/>
+          <w:i w:val="0"/>
+        </w:rPr>
+        <w:t>abre e fecha no clique do título</w:t>
+      </w:r>
+      <w:r>
+        <w:rPr>
+          <w:rFonts w:ascii="Segoe UI" w:hAnsi="Segoe UI"/>
+          <w:b w:val="0"/>
+          <w:i w:val="0"/>
+        </w:rPr>
+        <w:t>, e começa fechado — seis cadastros abertos ao mesmo tempo deixam o que você procura a três rolagens de distância. O número ao lado do nome diz quantos itens há dentro, então quadro fechado não se confunde com cadastro vazio. O que você abrir continua aberto na próxima visita, neste mesmo navegador.</w:t>
       </w:r>
     </w:p>
     <w:p>

</xml_diff>

<commit_message>
Perfil com Inicial Maiúscula, desfazendo o MAIÚSCULO que impus
Eu tinha convertido todo perfil para caixa alta por conta própria. Não foi
pedido e não havia razão: a grafia é escolha de quem cadastra.

Agora grava e mostra como se escreve — "Gestor", "Conferente", "Supervisor de
Área", com conector em minúscula. Nenhuma tela reescreve a caixa para exibir.

Em compensação, toda comparação de permissão passou a ser insensível a caixa:
podeConferir, podeVerPainel, ehAdmin, ultimoAdmin e as duas telas normalizam por
dentro. Sem isso, "conferente" perderia a aba que "Conferente" tem — que é
exatamente o risco de deixar a grafia livre.

Migração converte as linhas que eu já havia deixado em caixa alta.

A validação do servidor também exigia maiúscula e passou a aceitar as duas: ela
existe para barrar símbolo estranho, não para ditar estilo.

Co-Authored-By: Claude Opus 5 <noreply@anthropic.com>
</commit_message>
<xml_diff>
--- a/manual.docx
+++ b/manual.docx
@@ -3392,7 +3392,7 @@
           <w:b w:val="0"/>
           <w:i w:val="0"/>
         </w:rPr>
-        <w:t xml:space="preserve"> ADMIN faz os cadastros e as correções. CONFERENTE confere a devolução na chegada do galpão. GESTOR, GERENTE, MOTORISTA e PROMOTOR contam na rua — a contagem deles nasce </w:t>
+        <w:t xml:space="preserve"> Admin faz os cadastros e as correções. Conferente confere a devolução na chegada do galpão. Gestor, Gerente, Motorista e Promotor contam na rua — a contagem deles nasce </w:t>
       </w:r>
       <w:r>
         <w:rPr>
@@ -4362,7 +4362,7 @@
           <w:b w:val="0"/>
           <w:i w:val="0"/>
         </w:rPr>
-        <w:t xml:space="preserve"> no cadastro daquela pessoa. ADMIN entra sempre e não lança movimento — quem corrige não deve ser quem conta.</w:t>
+        <w:t xml:space="preserve"> no cadastro daquela pessoa. Admin entra sempre e não lança movimento — quem corrige não deve ser quem conta.</w:t>
       </w:r>
     </w:p>
     <w:tbl>
@@ -4518,7 +4518,7 @@
                 <w:i w:val="0"/>
                 <w:sz w:val="19"/>
               </w:rPr>
-              <w:t>MOTORISTA</w:t>
+              <w:t>Motorista</w:t>
             </w:r>
           </w:p>
         </w:tc>
@@ -4647,7 +4647,7 @@
                 <w:i w:val="0"/>
                 <w:sz w:val="19"/>
               </w:rPr>
-              <w:t>PROMOTOR</w:t>
+              <w:t>Promotor</w:t>
             </w:r>
           </w:p>
         </w:tc>
@@ -4776,7 +4776,7 @@
                 <w:i w:val="0"/>
                 <w:sz w:val="19"/>
               </w:rPr>
-              <w:t>GESTOR</w:t>
+              <w:t>Gestor</w:t>
             </w:r>
           </w:p>
         </w:tc>
@@ -4905,7 +4905,7 @@
                 <w:i w:val="0"/>
                 <w:sz w:val="19"/>
               </w:rPr>
-              <w:t>GERENTE</w:t>
+              <w:t>Gerente</w:t>
             </w:r>
           </w:p>
         </w:tc>
@@ -5034,7 +5034,7 @@
                 <w:i w:val="0"/>
                 <w:sz w:val="19"/>
               </w:rPr>
-              <w:t>CONFERENTE</w:t>
+              <w:t>Conferente</w:t>
             </w:r>
           </w:p>
         </w:tc>
@@ -5163,7 +5163,7 @@
                 <w:i w:val="0"/>
                 <w:sz w:val="19"/>
               </w:rPr>
-              <w:t>ADMIN</w:t>
+              <w:t>Admin</w:t>
             </w:r>
           </w:p>
         </w:tc>

</xml_diff>

<commit_message>
Motorista tem Tipo: Fixo ou Volante na rota
Campo no cadastro, coluna na lista, e — o ponto — ligado ao filtro que já
existia. Volante aparece na lista de todas as rotas, mesmo tendo rotas marcadas.
Guardar o tipo sem isso faria o campo mentir: você marcaria alguém como volante
e ele não apareceria na rota ao lado.

Vazio se comporta como curinga, que é o que mantém visíveis os onze motoristas
cadastrados antes deste campo existir. Nada muda para eles até alguém informar.

Mudança de comportamento deliberada: rota sem nenhum fixo agora cai nos
curingas, e não em todos. Arrastar o fixo de outra rota deixou de fazer sentido
quando passou a existir quem cobre qualquer uma. O beco continua fechado — sem
curinga nenhum, a lista volta a trazer todos para não travar a saída do galpão.
O teste antigo que afirmava o contrário foi atualizado, não contornado.

222 verificações.

Co-Authored-By: Claude Opus 5 <noreply@anthropic.com>
</commit_message>
<xml_diff>
--- a/manual.docx
+++ b/manual.docx
@@ -3197,6 +3197,72 @@
           <w:i w:val="0"/>
         </w:rPr>
         <w:t>, validade e placa habitual. É essa lista que aparece para escolha na saída do galpão.</w:t>
+      </w:r>
+    </w:p>
+    <w:p>
+      <w:r>
+        <w:rPr>
+          <w:rFonts w:ascii="Segoe UI" w:hAnsi="Segoe UI"/>
+          <w:b/>
+          <w:i w:val="0"/>
+        </w:rPr>
+        <w:t>Tipo:</w:t>
+      </w:r>
+      <w:r>
+        <w:rPr>
+          <w:rFonts w:ascii="Segoe UI" w:hAnsi="Segoe UI"/>
+          <w:b w:val="0"/>
+          <w:i w:val="0"/>
+        </w:rPr>
+        <w:t xml:space="preserve"> </w:t>
+      </w:r>
+      <w:r>
+        <w:rPr>
+          <w:rFonts w:ascii="Segoe UI" w:hAnsi="Segoe UI"/>
+          <w:b w:val="0"/>
+          <w:i/>
+        </w:rPr>
+        <w:t>Fixo</w:t>
+      </w:r>
+      <w:r>
+        <w:rPr>
+          <w:rFonts w:ascii="Segoe UI" w:hAnsi="Segoe UI"/>
+          <w:b w:val="0"/>
+          <w:i w:val="0"/>
+        </w:rPr>
+        <w:t xml:space="preserve"> é quem roda sempre as mesmas rotas; </w:t>
+      </w:r>
+      <w:r>
+        <w:rPr>
+          <w:rFonts w:ascii="Segoe UI" w:hAnsi="Segoe UI"/>
+          <w:b w:val="0"/>
+          <w:i/>
+        </w:rPr>
+        <w:t>Volante</w:t>
+      </w:r>
+      <w:r>
+        <w:rPr>
+          <w:rFonts w:ascii="Segoe UI" w:hAnsi="Segoe UI"/>
+          <w:b w:val="0"/>
+          <w:i w:val="0"/>
+        </w:rPr>
+        <w:t xml:space="preserve"> é quem cobre qualquer uma. O volante aparece na lista de </w:t>
+      </w:r>
+      <w:r>
+        <w:rPr>
+          <w:rFonts w:ascii="Segoe UI" w:hAnsi="Segoe UI"/>
+          <w:b/>
+          <w:i w:val="0"/>
+        </w:rPr>
+        <w:t>todas</w:t>
+      </w:r>
+      <w:r>
+        <w:rPr>
+          <w:rFonts w:ascii="Segoe UI" w:hAnsi="Segoe UI"/>
+          <w:b w:val="0"/>
+          <w:i w:val="0"/>
+        </w:rPr>
+        <w:t xml:space="preserve"> as rotas, mesmo que tenha rotas marcadas — se não fosse assim, o campo estaria mentindo. Deixar em branco tem o mesmo efeito prático de volante, e é como ficam os motoristas cadastrados antes deste campo existir.</w:t>
       </w:r>
     </w:p>
     <w:p>

</xml_diff>